<commit_message>
Users, Backup Manually: the new switches for users saving their own IAR/OAR
DreamGrid now has two switches for self-service IAR/OAR saves from the
web (DreamGrid commit 714a3729): a master switch on the System Backup
screen and a tick box on each user's Edit screen. Both must be on, and
both are off until the grid owner turns them on.

Users.docx: what the "Web IAR/OAR save" box does, and a CAUTION that the
master switch is needed too.

Backup Manually.docx: new section "Letting users save their own IAR and
OAR" - what it does, the two steps to switch it on, the 24 hour link,
the need for email, who is not affected, and a CAUTION about lag.

Both .htm exports are now out of date.

Co-Authored-By: Claude Fable 5.1 <noreply@anthropic.com>
</commit_message>
<xml_diff>
--- a/Backup Manually.docx
+++ b/Backup Manually.docx
@@ -202,6 +202,69 @@
       </w:r>
       <w:r>
         <w:t xml:space="preserve"> monthly thing to do.</w:t>
+      </w:r>
+    </w:p>
+    <w:p>
+      <w:pPr>
+        <w:pStyle w:val="Heading2"/>
+        <w:keepNext/>
+        <w:rPr>
+          <w:rFonts w:eastAsia="Times New Roman"/>
+        </w:rPr>
+      </w:pPr>
+      <w:r>
+        <w:rPr>
+          <w:rFonts w:eastAsia="Times New Roman"/>
+          <w:color w:val="000000"/>
+        </w:rPr>
+        <w:t>Letting users save their own IAR and OAR</w:t>
+      </w:r>
+    </w:p>
+    <w:p>
+      <w:r>
+        <w:t xml:space="preserve">DreamGrid can let a user make their own backup from the web. A user can save their own inventory as an IAR. An estate owner can save a region on their estate as an OAR. When the file is ready, DreamGrid emails the user a link to download it. The link stops working after 24 hours.</w:t>
+      </w:r>
+    </w:p>
+    <w:p>
+      <w:r>
+        <w:t xml:space="preserve">This is switched off when DreamGrid is installed. To switch it on, do both of these steps:</w:t>
+      </w:r>
+    </w:p>
+    <w:p>
+      <w:r>
+        <w:t xml:space="preserve">- Tick “Let users save their own IAR and OAR from the web” on the System Backup screen. This is the master switch for the whole grid.</w:t>
+      </w:r>
+    </w:p>
+    <w:p>
+      <w:r>
+        <w:t xml:space="preserve">- Open each user you want to allow, and tick “Web IAR/OAR save” on their Edit screen.</w:t>
+      </w:r>
+    </w:p>
+    <w:p>
+      <w:r>
+        <w:t xml:space="preserve">A user who is not ticked is refused, even when the master switch is on. Untick the master switch to stop it for everyone at once.</w:t>
+      </w:r>
+    </w:p>
+    <w:p>
+      <w:r>
+        <w:t xml:space="preserve">Email must be set up in DreamGrid, and the user must have an email address, or no link is emailed.</w:t>
+      </w:r>
+    </w:p>
+    <w:p>
+      <w:r>
+        <w:t xml:space="preserve">Grid administrators are not affected by these switches. DreamGrid’s own automatic backups are not affected either.</w:t>
+      </w:r>
+    </w:p>
+    <w:p>
+      <w:r>
+        <w:rPr>
+          <w:b/>
+          <w:bCs/>
+        </w:rPr>
+        <w:t xml:space="preserve">CAUTION: </w:t>
+      </w:r>
+      <w:r>
+        <w:t xml:space="preserve">Saving an IAR or an OAR is slow and can lag the grid while it runs. Only allow users you trust not to overuse it.</w:t>
       </w:r>
     </w:p>
     <w:p>

</xml_diff>